<commit_message>
fix(analysis): price persistent flags per verification standard
</commit_message>
<xml_diff>
--- a/docs/ops/VERIFIER_STANDARDS_ANALYSIS.docx
+++ b/docs/ops/VERIFIER_STANDARDS_ANALYSIS.docx
@@ -7,6 +7,9 @@
         <w:pStyle w:val="Heading1"/>
       </w:pPr>
       <w:r>
+        <w:rPr>
+          <w:color w:val="000000"/>
+        </w:rPr>
         <w:t>Verification standards: what they cost, what they buy, and what an approval standard should be</w:t>
       </w:r>
     </w:p>
@@ -17,7 +20,12 @@
     </w:p>
     <w:p>
       <w:r>
-        <w:t>Reproduce the numbers with python -m tools.verifier_standards_model and the data scripts named below.</w:t>
+        <w:t>Reproduce the numbers with python -m tools.verifier_standards_model --operating-points docs/evidence/verifier-standards/operating-points-35-cases.json and the data scripts named below.</w:t>
+      </w:r>
+    </w:p>
+    <w:p>
+      <w:r>
+        <w:t>Policy status as of 2026-10-23: this report compares exploratory alternatives. The adopted production experiment is the seven-day shadow in docs/ops/VERIFIER_SHADOW.md and config/verifier_shadow.json. The fourteen-day alternative below is not adopted; this analysis changes no CI, review, merge or model-promotion gate.</w:t>
       </w:r>
     </w:p>
     <w:p>
@@ -25,6 +33,9 @@
         <w:pStyle w:val="Heading2"/>
       </w:pPr>
       <w:r>
+        <w:rPr>
+          <w:color w:val="000000"/>
+        </w:rPr>
         <w:t>1. Bottom line</w:t>
       </w:r>
     </w:p>
@@ -47,16 +58,15 @@
       <w:pPr>
         <w:pStyle w:val="ListNumber"/>
       </w:pPr>
-      <w:r/>
+      <w:r>
+        <w:t>Strictness is the expensive part, not verification. A verifier that blocks hard on every non-PASS adds about 1.8 delay-hours per verified PR against 0.65 for the same verifier with a two-hour time box, because the flags on good PRs are persistent: the same two good PRs were flagged by all five judges. Hard blocking uses about 24 of the owner's 30 weekly minutes on persistent flags alone. A verifier that rejects everything adds 11.75 hours per PR and needs 189 human minutes a week: nothing moves.</w:t>
+      </w:r>
       <w:r>
         <w:rPr>
           <w:b/>
         </w:rPr>
-        <w:t>Strictness is the expensive part, not verification.</w:t>
       </w:r>
-      <w:r>
-        <w:t xml:space="preserve"> A verifier that blocks hard on every non-PASS adds about 1.8 delay-hours per verified PR against 0.65 for the same verifier with a two-hour time box, because the flags on good PRs are persistent: the same two good PRs were flagged by all five judges. Hard blocking uses about 24 of the owner's 30 weekly minutes on persistent flags alone. A verifier that rejects everything adds 8.3 hours per PR and needs 126 human minutes a week: nothing moves.</w:t>
-      </w:r>
+      <w:r/>
     </w:p>
     <w:p>
       <w:pPr>
@@ -120,6 +130,9 @@
         <w:pStyle w:val="Heading2"/>
       </w:pPr>
       <w:r>
+        <w:rPr>
+          <w:color w:val="000000"/>
+        </w:rPr>
         <w:t>2. What was measured, and what each number means</w:t>
       </w:r>
     </w:p>
@@ -129,6 +142,14 @@
         <w:tblW w:type="auto" w:w="0"/>
         <w:jc w:val="center"/>
         <w:tblLook w:firstColumn="1" w:firstRow="1" w:lastColumn="0" w:lastRow="0" w:noHBand="0" w:noVBand="1" w:val="04A0"/>
+        <w:tblBorders>
+          <w:top w:val="single" w:sz="4" w:color="D9D9D9"/>
+          <w:left w:val="single" w:sz="4" w:color="D9D9D9"/>
+          <w:bottom w:val="single" w:sz="4" w:color="D9D9D9"/>
+          <w:right w:val="single" w:sz="4" w:color="D9D9D9"/>
+          <w:insideH w:val="single" w:sz="4" w:color="D9D9D9"/>
+          <w:insideV w:val="single" w:sz="4" w:color="D9D9D9"/>
+        </w:tblBorders>
       </w:tblPr>
       <w:tblGrid>
         <w:gridCol w:w="3216"/>
@@ -136,6 +157,9 @@
         <w:gridCol w:w="3216"/>
       </w:tblGrid>
       <w:tr>
+        <w:trPr>
+          <w:tblHeader/>
+        </w:trPr>
         <w:tc>
           <w:tcPr>
             <w:tcW w:type="dxa" w:w="3216"/>
@@ -640,6 +664,9 @@
         <w:pStyle w:val="Heading2"/>
       </w:pPr>
       <w:r>
+        <w:rPr>
+          <w:color w:val="000000"/>
+        </w:rPr>
         <w:t>3. Operating points of the standards considered</w:t>
       </w:r>
     </w:p>
@@ -654,6 +681,14 @@
         <w:tblW w:type="auto" w:w="0"/>
         <w:jc w:val="center"/>
         <w:tblLook w:firstColumn="1" w:firstRow="1" w:lastColumn="0" w:lastRow="0" w:noHBand="0" w:noVBand="1" w:val="04A0"/>
+        <w:tblBorders>
+          <w:top w:val="single" w:sz="4" w:color="D9D9D9"/>
+          <w:left w:val="single" w:sz="4" w:color="D9D9D9"/>
+          <w:bottom w:val="single" w:sz="4" w:color="D9D9D9"/>
+          <w:right w:val="single" w:sz="4" w:color="D9D9D9"/>
+          <w:insideH w:val="single" w:sz="4" w:color="D9D9D9"/>
+          <w:insideV w:val="single" w:sz="4" w:color="D9D9D9"/>
+        </w:tblBorders>
       </w:tblPr>
       <w:tblGrid>
         <w:gridCol w:w="3216"/>
@@ -661,6 +696,9 @@
         <w:gridCol w:w="3216"/>
       </w:tblGrid>
       <w:tr>
+        <w:trPr>
+          <w:tblHeader/>
+        </w:trPr>
         <w:tc>
           <w:tcPr>
             <w:tcW w:type="dxa" w:w="3216"/>
@@ -1156,6 +1194,9 @@
         <w:pStyle w:val="Heading2"/>
       </w:pPr>
       <w:r>
+        <w:rPr>
+          <w:color w:val="000000"/>
+        </w:rPr>
         <w:t>4. The cost model</w:t>
       </w:r>
     </w:p>
@@ -1177,17 +1218,14 @@
         <w:pStyle w:val="ListBullet"/>
       </w:pPr>
       <w:r>
-        <w:t xml:space="preserve">A false flag on a good PR costs one fix round, 1.0 hour (assumed). If the flag is </w:t>
+        <w:t>A false flag on a good PR costs one fix round, 1.0 hour (assumed). If the flag is persistent (every judge repeats it: 2/3 of the flags for luna and terra, 2/2 for Claude, Cursor and Muse; combinations use their own flagged-case denominator. Reject-all flags persist by definition), a fix round cannot clear it: under a hard block it waits for a human, 12 hours (assumed), and costs 15 human minutes (assumed); under a time box it waits the box, 2 hours, then merges.</w:t>
       </w:r>
       <w:r>
         <w:rPr>
           <w:b/>
         </w:rPr>
-        <w:t>persistent</w:t>
       </w:r>
-      <w:r>
-        <w:t xml:space="preserve"> (every judge repeats it, 2 of 3 flagged cases here), a fix round cannot clear it: under a hard block it waits for a human, 12 hours (assumed), and costs 15 human minutes (assumed); under a time box it waits the box, 2 hours, then merges.</w:t>
-      </w:r>
+      <w:r/>
     </w:p>
     <w:p>
       <w:pPr>
@@ -1218,6 +1256,9 @@
         <w:pStyle w:val="Heading3"/>
       </w:pPr>
       <w:r>
+        <w:rPr>
+          <w:color w:val="000000"/>
+        </w:rPr>
         <w:t>4.1 Central case: 5% bad, escape costs 10 fix rounds</w:t>
       </w:r>
     </w:p>
@@ -1232,6 +1273,14 @@
         <w:tblW w:type="auto" w:w="0"/>
         <w:jc w:val="center"/>
         <w:tblLook w:firstColumn="1" w:firstRow="1" w:lastColumn="0" w:lastRow="0" w:noHBand="0" w:noVBand="1" w:val="04A0"/>
+        <w:tblBorders>
+          <w:top w:val="single" w:sz="4" w:color="D9D9D9"/>
+          <w:left w:val="single" w:sz="4" w:color="D9D9D9"/>
+          <w:bottom w:val="single" w:sz="4" w:color="D9D9D9"/>
+          <w:right w:val="single" w:sz="4" w:color="D9D9D9"/>
+          <w:insideH w:val="single" w:sz="4" w:color="D9D9D9"/>
+          <w:insideV w:val="single" w:sz="4" w:color="D9D9D9"/>
+        </w:tblBorders>
       </w:tblPr>
       <w:tblGrid>
         <w:gridCol w:w="1930"/>
@@ -1241,6 +1290,9 @@
         <w:gridCol w:w="1930"/>
       </w:tblGrid>
       <w:tr>
+        <w:trPr>
+          <w:tblHeader/>
+        </w:trPr>
         <w:tc>
           <w:tcPr>
             <w:tcW w:type="dxa" w:w="1930"/>
@@ -1495,7 +1547,7 @@
                 <w:b w:val="0"/>
                 <w:sz w:val="16"/>
               </w:rPr>
-              <w:t>0.60</w:t>
+              <w:t>0.63</w:t>
             </w:r>
           </w:p>
         </w:tc>
@@ -1509,7 +1561,7 @@
                 <w:b w:val="0"/>
                 <w:sz w:val="16"/>
               </w:rPr>
-              <w:t>1.39</w:t>
+              <w:t>1.82</w:t>
             </w:r>
           </w:p>
         </w:tc>
@@ -1523,7 +1575,7 @@
                 <w:b w:val="0"/>
                 <w:sz w:val="16"/>
               </w:rPr>
-              <w:t>16</w:t>
+              <w:t>24</w:t>
             </w:r>
           </w:p>
         </w:tc>
@@ -1567,7 +1619,7 @@
                 <w:b w:val="0"/>
                 <w:sz w:val="16"/>
               </w:rPr>
-              <w:t>0.69</w:t>
+              <w:t>0.73</w:t>
             </w:r>
           </w:p>
         </w:tc>
@@ -1581,7 +1633,7 @@
                 <w:b w:val="0"/>
                 <w:sz w:val="16"/>
               </w:rPr>
-              <w:t>1.48</w:t>
+              <w:t>1.92</w:t>
             </w:r>
           </w:p>
         </w:tc>
@@ -1595,7 +1647,7 @@
                 <w:b w:val="0"/>
                 <w:sz w:val="16"/>
               </w:rPr>
-              <w:t>16</w:t>
+              <w:t>24</w:t>
             </w:r>
           </w:p>
         </w:tc>
@@ -1725,7 +1777,7 @@
                 <w:b w:val="0"/>
                 <w:sz w:val="16"/>
               </w:rPr>
-              <w:t>8.3</w:t>
+              <w:t>11.75</w:t>
             </w:r>
           </w:p>
         </w:tc>
@@ -1739,7 +1791,7 @@
                 <w:b w:val="0"/>
                 <w:sz w:val="16"/>
               </w:rPr>
-              <w:t>126</w:t>
+              <w:t>189</w:t>
             </w:r>
           </w:p>
         </w:tc>
@@ -1756,6 +1808,9 @@
         <w:pStyle w:val="Heading3"/>
       </w:pPr>
       <w:r>
+        <w:rPr>
+          <w:color w:val="000000"/>
+        </w:rPr>
         <w:t>4.2 Where verification pays: gain in delay-hours per PR against no verification (positive = worth it)</w:t>
       </w:r>
     </w:p>
@@ -1770,6 +1825,14 @@
         <w:tblW w:type="auto" w:w="0"/>
         <w:jc w:val="center"/>
         <w:tblLook w:firstColumn="1" w:firstRow="1" w:lastColumn="0" w:lastRow="0" w:noHBand="0" w:noVBand="1" w:val="04A0"/>
+        <w:tblBorders>
+          <w:top w:val="single" w:sz="4" w:color="D9D9D9"/>
+          <w:left w:val="single" w:sz="4" w:color="D9D9D9"/>
+          <w:bottom w:val="single" w:sz="4" w:color="D9D9D9"/>
+          <w:right w:val="single" w:sz="4" w:color="D9D9D9"/>
+          <w:insideH w:val="single" w:sz="4" w:color="D9D9D9"/>
+          <w:insideV w:val="single" w:sz="4" w:color="D9D9D9"/>
+        </w:tblBorders>
       </w:tblPr>
       <w:tblGrid>
         <w:gridCol w:w="2412"/>
@@ -1778,6 +1841,9 @@
         <w:gridCol w:w="2412"/>
       </w:tblGrid>
       <w:tr>
+        <w:trPr>
+          <w:tblHeader/>
+        </w:trPr>
         <w:tc>
           <w:tcPr>
             <w:tcW w:type="dxa" w:w="2412"/>
@@ -2021,6 +2087,9 @@
         <w:pStyle w:val="Heading3"/>
       </w:pPr>
       <w:r>
+        <w:rPr>
+          <w:color w:val="000000"/>
+        </w:rPr>
         <w:t>4.3 How much of the benchmark's detection survives in production</w:t>
       </w:r>
     </w:p>
@@ -2034,6 +2103,9 @@
         <w:pStyle w:val="Heading2"/>
       </w:pPr>
       <w:r>
+        <w:rPr>
+          <w:color w:val="000000"/>
+        </w:rPr>
         <w:t>5. Approval standards for a model</w:t>
       </w:r>
     </w:p>
@@ -2048,6 +2120,14 @@
         <w:tblW w:type="auto" w:w="0"/>
         <w:jc w:val="center"/>
         <w:tblLook w:firstColumn="1" w:firstRow="1" w:lastColumn="0" w:lastRow="0" w:noHBand="0" w:noVBand="1" w:val="04A0"/>
+        <w:tblBorders>
+          <w:top w:val="single" w:sz="4" w:color="D9D9D9"/>
+          <w:left w:val="single" w:sz="4" w:color="D9D9D9"/>
+          <w:bottom w:val="single" w:sz="4" w:color="D9D9D9"/>
+          <w:right w:val="single" w:sz="4" w:color="D9D9D9"/>
+          <w:insideH w:val="single" w:sz="4" w:color="D9D9D9"/>
+          <w:insideV w:val="single" w:sz="4" w:color="D9D9D9"/>
+        </w:tblBorders>
       </w:tblPr>
       <w:tblGrid>
         <w:gridCol w:w="1378"/>
@@ -2059,6 +2139,9 @@
         <w:gridCol w:w="1378"/>
       </w:tblGrid>
       <w:tr>
+        <w:trPr>
+          <w:tblHeader/>
+        </w:trPr>
         <w:tc>
           <w:tcPr>
             <w:tcW w:type="dxa" w:w="1378"/>
@@ -2811,6 +2894,14 @@
         <w:tblW w:type="auto" w:w="0"/>
         <w:jc w:val="center"/>
         <w:tblLook w:firstColumn="1" w:firstRow="1" w:lastColumn="0" w:lastRow="0" w:noHBand="0" w:noVBand="1" w:val="04A0"/>
+        <w:tblBorders>
+          <w:top w:val="single" w:sz="4" w:color="D9D9D9"/>
+          <w:left w:val="single" w:sz="4" w:color="D9D9D9"/>
+          <w:bottom w:val="single" w:sz="4" w:color="D9D9D9"/>
+          <w:right w:val="single" w:sz="4" w:color="D9D9D9"/>
+          <w:insideH w:val="single" w:sz="4" w:color="D9D9D9"/>
+          <w:insideV w:val="single" w:sz="4" w:color="D9D9D9"/>
+        </w:tblBorders>
       </w:tblPr>
       <w:tblGrid>
         <w:gridCol w:w="1608"/>
@@ -2821,6 +2912,9 @@
         <w:gridCol w:w="1608"/>
       </w:tblGrid>
       <w:tr>
+        <w:trPr>
+          <w:tblHeader/>
+        </w:trPr>
         <w:tc>
           <w:tcPr>
             <w:tcW w:type="dxa" w:w="1608"/>
@@ -3429,6 +3523,9 @@
         <w:pStyle w:val="Heading2"/>
       </w:pPr>
       <w:r>
+        <w:rPr>
+          <w:color w:val="000000"/>
+        </w:rPr>
         <w:t>6. Recommended standards</w:t>
       </w:r>
     </w:p>
@@ -3475,6 +3572,9 @@
       </w:r>
     </w:p>
     <w:p>
+      <w:pPr>
+        <w:keepNext/>
+      </w:pPr>
       <w:r/>
       <w:r>
         <w:rPr>
@@ -3526,6 +3626,9 @@
         <w:pStyle w:val="Heading2"/>
       </w:pPr>
       <w:r>
+        <w:rPr>
+          <w:color w:val="000000"/>
+        </w:rPr>
         <w:t>7. What would change the conclusion</w:t>
       </w:r>
     </w:p>
@@ -3609,6 +3712,9 @@
         <w:pStyle w:val="Heading2"/>
       </w:pPr>
       <w:r>
+        <w:rPr>
+          <w:color w:val="000000"/>
+        </w:rPr>
         <w:t>8. Checks that would show this is working</w:t>
       </w:r>
     </w:p>
@@ -3618,12 +3724,23 @@
         <w:tblW w:type="auto" w:w="0"/>
         <w:jc w:val="center"/>
         <w:tblLook w:firstColumn="1" w:firstRow="1" w:lastColumn="0" w:lastRow="0" w:noHBand="0" w:noVBand="1" w:val="04A0"/>
+        <w:tblBorders>
+          <w:top w:val="single" w:sz="4" w:color="D9D9D9"/>
+          <w:left w:val="single" w:sz="4" w:color="D9D9D9"/>
+          <w:bottom w:val="single" w:sz="4" w:color="D9D9D9"/>
+          <w:right w:val="single" w:sz="4" w:color="D9D9D9"/>
+          <w:insideH w:val="single" w:sz="4" w:color="D9D9D9"/>
+          <w:insideV w:val="single" w:sz="4" w:color="D9D9D9"/>
+        </w:tblBorders>
       </w:tblPr>
       <w:tblGrid>
         <w:gridCol w:w="4824"/>
         <w:gridCol w:w="4824"/>
       </w:tblGrid>
       <w:tr>
+        <w:trPr>
+          <w:tblHeader/>
+        </w:trPr>
         <w:tc>
           <w:tcPr>
             <w:tcW w:type="dxa" w:w="4824"/>
@@ -4220,7 +4337,7 @@
       <w:rFonts w:asciiTheme="majorHAnsi" w:eastAsiaTheme="majorEastAsia" w:hAnsiTheme="majorHAnsi" w:cstheme="majorBidi" w:ascii="Arial" w:hAnsi="Arial"/>
       <w:b/>
       <w:bCs/>
-      <w:color w:val="365F91" w:themeColor="accent1" w:themeShade="BF"/>
+      <w:color w:val="000000"/>
       <w:sz w:val="32"/>
       <w:szCs w:val="28"/>
     </w:rPr>
@@ -4244,7 +4361,7 @@
       <w:rFonts w:asciiTheme="majorHAnsi" w:eastAsiaTheme="majorEastAsia" w:hAnsiTheme="majorHAnsi" w:cstheme="majorBidi" w:ascii="Arial" w:hAnsi="Arial"/>
       <w:b/>
       <w:bCs/>
-      <w:color w:val="4F81BD" w:themeColor="accent1"/>
+      <w:color w:val="000000"/>
       <w:sz w:val="26"/>
       <w:szCs w:val="26"/>
     </w:rPr>
@@ -4268,7 +4385,7 @@
       <w:rFonts w:asciiTheme="majorHAnsi" w:eastAsiaTheme="majorEastAsia" w:hAnsiTheme="majorHAnsi" w:cstheme="majorBidi" w:ascii="Arial" w:hAnsi="Arial"/>
       <w:b/>
       <w:bCs/>
-      <w:color w:val="4F81BD" w:themeColor="accent1"/>
+      <w:color w:val="000000"/>
       <w:sz w:val="22"/>
     </w:rPr>
   </w:style>
@@ -4294,7 +4411,7 @@
       <w:bCs/>
       <w:i/>
       <w:iCs/>
-      <w:color w:val="4F81BD" w:themeColor="accent1"/>
+      <w:color w:val="000000"/>
     </w:rPr>
   </w:style>
   <w:style w:type="paragraph" w:styleId="Heading5">
@@ -4315,7 +4432,7 @@
     </w:pPr>
     <w:rPr>
       <w:rFonts w:asciiTheme="majorHAnsi" w:eastAsiaTheme="majorEastAsia" w:hAnsiTheme="majorHAnsi" w:cstheme="majorBidi"/>
-      <w:color w:val="243F60" w:themeColor="accent1" w:themeShade="7F"/>
+      <w:color w:val="000000"/>
     </w:rPr>
   </w:style>
   <w:style w:type="paragraph" w:styleId="Heading6">
@@ -4338,7 +4455,7 @@
       <w:rFonts w:asciiTheme="majorHAnsi" w:eastAsiaTheme="majorEastAsia" w:hAnsiTheme="majorHAnsi" w:cstheme="majorBidi"/>
       <w:i/>
       <w:iCs/>
-      <w:color w:val="243F60" w:themeColor="accent1" w:themeShade="7F"/>
+      <w:color w:val="000000"/>
     </w:rPr>
   </w:style>
   <w:style w:type="paragraph" w:styleId="Heading7">
@@ -4361,7 +4478,7 @@
       <w:rFonts w:asciiTheme="majorHAnsi" w:eastAsiaTheme="majorEastAsia" w:hAnsiTheme="majorHAnsi" w:cstheme="majorBidi"/>
       <w:i/>
       <w:iCs/>
-      <w:color w:val="404040" w:themeColor="text1" w:themeTint="BF"/>
+      <w:color w:val="000000"/>
     </w:rPr>
   </w:style>
   <w:style w:type="paragraph" w:styleId="Heading8">
@@ -4382,7 +4499,7 @@
     </w:pPr>
     <w:rPr>
       <w:rFonts w:asciiTheme="majorHAnsi" w:eastAsiaTheme="majorEastAsia" w:hAnsiTheme="majorHAnsi" w:cstheme="majorBidi"/>
-      <w:color w:val="4F81BD" w:themeColor="accent1"/>
+      <w:color w:val="000000"/>
       <w:sz w:val="20"/>
       <w:szCs w:val="20"/>
     </w:rPr>
@@ -4407,7 +4524,7 @@
       <w:rFonts w:asciiTheme="majorHAnsi" w:eastAsiaTheme="majorEastAsia" w:hAnsiTheme="majorHAnsi" w:cstheme="majorBidi"/>
       <w:i/>
       <w:iCs/>
-      <w:color w:val="404040" w:themeColor="text1" w:themeTint="BF"/>
+      <w:color w:val="000000"/>
       <w:sz w:val="20"/>
       <w:szCs w:val="20"/>
     </w:rPr>
@@ -4508,7 +4625,7 @@
     </w:pPr>
     <w:rPr>
       <w:rFonts w:asciiTheme="majorHAnsi" w:eastAsiaTheme="majorEastAsia" w:hAnsiTheme="majorHAnsi" w:cstheme="majorBidi"/>
-      <w:color w:val="17365D" w:themeColor="text2" w:themeShade="BF"/>
+      <w:color w:val="000000"/>
       <w:spacing w:val="5"/>
       <w:kern w:val="28"/>
       <w:sz w:val="52"/>
@@ -4547,7 +4664,7 @@
       <w:rFonts w:asciiTheme="majorHAnsi" w:eastAsiaTheme="majorEastAsia" w:hAnsiTheme="majorHAnsi" w:cstheme="majorBidi"/>
       <w:i/>
       <w:iCs/>
-      <w:color w:val="4F81BD" w:themeColor="accent1"/>
+      <w:color w:val="000000"/>
       <w:spacing w:val="15"/>
       <w:sz w:val="24"/>
       <w:szCs w:val="24"/>

</xml_diff>